<commit_message>
Population Data: Collection adn preprocessing
</commit_message>
<xml_diff>
--- a/data/Data.docx
+++ b/data/Data.docx
@@ -19,7 +19,7 @@
         </w:trPr>
         <w:tc>
           <w:tcPr>
-            <w:tcW w:w="1870" w:type="dxa"/>
+            <w:tcW w:w="2136" w:type="dxa"/>
             <w:vAlign w:val="center"/>
           </w:tcPr>
           <w:p>
@@ -39,7 +39,7 @@
         </w:tc>
         <w:tc>
           <w:tcPr>
-            <w:tcW w:w="6820" w:type="dxa"/>
+            <w:tcW w:w="6555" w:type="dxa"/>
             <w:vAlign w:val="center"/>
           </w:tcPr>
           <w:p>
@@ -59,7 +59,7 @@
         </w:tc>
         <w:tc>
           <w:tcPr>
-            <w:tcW w:w="805" w:type="dxa"/>
+            <w:tcW w:w="804" w:type="dxa"/>
             <w:vAlign w:val="center"/>
           </w:tcPr>
           <w:p>
@@ -84,7 +84,7 @@
         </w:trPr>
         <w:tc>
           <w:tcPr>
-            <w:tcW w:w="1870" w:type="dxa"/>
+            <w:tcW w:w="2136" w:type="dxa"/>
             <w:vMerge w:val="restart"/>
             <w:vAlign w:val="center"/>
           </w:tcPr>
@@ -107,7 +107,7 @@
         </w:tc>
         <w:tc>
           <w:tcPr>
-            <w:tcW w:w="6820" w:type="dxa"/>
+            <w:tcW w:w="6555" w:type="dxa"/>
             <w:vAlign w:val="center"/>
           </w:tcPr>
           <w:p>
@@ -130,7 +130,7 @@
         </w:tc>
         <w:tc>
           <w:tcPr>
-            <w:tcW w:w="805" w:type="dxa"/>
+            <w:tcW w:w="804" w:type="dxa"/>
             <w:vAlign w:val="center"/>
           </w:tcPr>
           <w:p>
@@ -160,7 +160,7 @@
         </w:trPr>
         <w:tc>
           <w:tcPr>
-            <w:tcW w:w="1870" w:type="dxa"/>
+            <w:tcW w:w="2136" w:type="dxa"/>
             <w:vMerge/>
             <w:vAlign w:val="center"/>
           </w:tcPr>
@@ -177,7 +177,7 @@
         </w:tc>
         <w:tc>
           <w:tcPr>
-            <w:tcW w:w="6820" w:type="dxa"/>
+            <w:tcW w:w="6555" w:type="dxa"/>
             <w:vAlign w:val="center"/>
           </w:tcPr>
           <w:p>
@@ -193,49 +193,13 @@
                 <w:b/>
                 <w:bCs/>
               </w:rPr>
-              <w:t xml:space="preserve">La </w:t>
+              <w:t>La liste des hôpitaux 2022</w:t>
             </w:r>
-            <w:proofErr w:type="spellStart"/>
-            <w:r>
-              <w:rPr>
-                <w:rFonts w:asciiTheme="majorBidi" w:hAnsiTheme="majorBidi" w:cstheme="majorBidi"/>
-                <w:b/>
-                <w:bCs/>
-              </w:rPr>
-              <w:t>liste</w:t>
-            </w:r>
-            <w:proofErr w:type="spellEnd"/>
-            <w:r>
-              <w:rPr>
-                <w:rFonts w:asciiTheme="majorBidi" w:hAnsiTheme="majorBidi" w:cstheme="majorBidi"/>
-                <w:b/>
-                <w:bCs/>
-              </w:rPr>
-              <w:t xml:space="preserve"> des </w:t>
-            </w:r>
-            <w:proofErr w:type="spellStart"/>
-            <w:r>
-              <w:rPr>
-                <w:rFonts w:asciiTheme="majorBidi" w:hAnsiTheme="majorBidi" w:cstheme="majorBidi"/>
-                <w:b/>
-                <w:bCs/>
-              </w:rPr>
-              <w:t>hôpitaux</w:t>
-            </w:r>
-            <w:proofErr w:type="spellEnd"/>
-            <w:r>
-              <w:rPr>
-                <w:rFonts w:asciiTheme="majorBidi" w:hAnsiTheme="majorBidi" w:cstheme="majorBidi"/>
-                <w:b/>
-                <w:bCs/>
-              </w:rPr>
-              <w:t xml:space="preserve"> 2022</w:t>
-            </w:r>
-          </w:p>
-        </w:tc>
-        <w:tc>
-          <w:tcPr>
-            <w:tcW w:w="805" w:type="dxa"/>
+          </w:p>
+        </w:tc>
+        <w:tc>
+          <w:tcPr>
+            <w:tcW w:w="804" w:type="dxa"/>
             <w:vAlign w:val="center"/>
           </w:tcPr>
           <w:p>
@@ -265,7 +229,7 @@
         </w:trPr>
         <w:tc>
           <w:tcPr>
-            <w:tcW w:w="1870" w:type="dxa"/>
+            <w:tcW w:w="2136" w:type="dxa"/>
             <w:vMerge/>
             <w:vAlign w:val="center"/>
           </w:tcPr>
@@ -283,7 +247,7 @@
         </w:tc>
         <w:tc>
           <w:tcPr>
-            <w:tcW w:w="6820" w:type="dxa"/>
+            <w:tcW w:w="6555" w:type="dxa"/>
             <w:vAlign w:val="center"/>
           </w:tcPr>
           <w:p>
@@ -306,7 +270,7 @@
         </w:tc>
         <w:tc>
           <w:tcPr>
-            <w:tcW w:w="805" w:type="dxa"/>
+            <w:tcW w:w="804" w:type="dxa"/>
             <w:vAlign w:val="center"/>
           </w:tcPr>
           <w:p>
@@ -336,9 +300,7 @@
         </w:trPr>
         <w:tc>
           <w:tcPr>
-            <w:tcW w:w="1870" w:type="dxa"/>
-            <w:vMerge w:val="restart"/>
-            <w:vAlign w:val="center"/>
+            <w:tcW w:w="2136" w:type="dxa"/>
           </w:tcPr>
           <w:p>
             <w:pPr>
@@ -359,7 +321,7 @@
         </w:tc>
         <w:tc>
           <w:tcPr>
-            <w:tcW w:w="6820" w:type="dxa"/>
+            <w:tcW w:w="6555" w:type="dxa"/>
             <w:vAlign w:val="center"/>
           </w:tcPr>
           <w:p>
@@ -374,13 +336,13 @@
                 <w:rFonts w:asciiTheme="majorBidi" w:hAnsiTheme="majorBidi" w:cstheme="majorBidi"/>
                 <w:lang w:val="fr-FR"/>
               </w:rPr>
-              <w:t>Bus stops Data</w:t>
+              <w:t>Amenity : Hospitals &amp; Clinics data</w:t>
             </w:r>
           </w:p>
         </w:tc>
         <w:tc>
           <w:tcPr>
-            <w:tcW w:w="805" w:type="dxa"/>
+            <w:tcW w:w="804" w:type="dxa"/>
             <w:vAlign w:val="center"/>
           </w:tcPr>
           <w:p>
@@ -400,106 +362,11 @@
         </w:trPr>
         <w:tc>
           <w:tcPr>
-            <w:tcW w:w="1870" w:type="dxa"/>
-            <w:vMerge/>
-          </w:tcPr>
-          <w:p>
-            <w:pPr>
-              <w:rPr>
-                <w:rFonts w:asciiTheme="majorBidi" w:hAnsiTheme="majorBidi" w:cstheme="majorBidi"/>
-                <w:lang w:val="fr-FR"/>
-              </w:rPr>
-            </w:pPr>
-          </w:p>
-        </w:tc>
-        <w:tc>
-          <w:tcPr>
-            <w:tcW w:w="6820" w:type="dxa"/>
-            <w:vAlign w:val="center"/>
-          </w:tcPr>
-          <w:p>
-            <w:pPr>
-              <w:rPr>
-                <w:rFonts w:asciiTheme="majorBidi" w:hAnsiTheme="majorBidi" w:cstheme="majorBidi"/>
-                <w:lang w:val="fr-FR"/>
-              </w:rPr>
-            </w:pPr>
-            <w:proofErr w:type="spellStart"/>
-            <w:r>
-              <w:rPr>
-                <w:rFonts w:asciiTheme="majorBidi" w:hAnsiTheme="majorBidi" w:cstheme="majorBidi"/>
-                <w:lang w:val="fr-FR"/>
-              </w:rPr>
-              <w:t>Amenity</w:t>
-            </w:r>
-            <w:proofErr w:type="spellEnd"/>
-            <w:r>
-              <w:rPr>
-                <w:rFonts w:asciiTheme="majorBidi" w:hAnsiTheme="majorBidi" w:cstheme="majorBidi"/>
-                <w:lang w:val="fr-FR"/>
-              </w:rPr>
-              <w:t xml:space="preserve"> : </w:t>
-            </w:r>
-            <w:proofErr w:type="spellStart"/>
-            <w:r>
-              <w:rPr>
-                <w:rFonts w:asciiTheme="majorBidi" w:hAnsiTheme="majorBidi" w:cstheme="majorBidi"/>
-                <w:lang w:val="fr-FR"/>
-              </w:rPr>
-              <w:t>Hospitals</w:t>
-            </w:r>
-            <w:proofErr w:type="spellEnd"/>
-            <w:r>
-              <w:rPr>
-                <w:rFonts w:asciiTheme="majorBidi" w:hAnsiTheme="majorBidi" w:cstheme="majorBidi"/>
-                <w:lang w:val="fr-FR"/>
-              </w:rPr>
-              <w:t xml:space="preserve"> &amp; </w:t>
-            </w:r>
-            <w:proofErr w:type="spellStart"/>
-            <w:r>
-              <w:rPr>
-                <w:rFonts w:asciiTheme="majorBidi" w:hAnsiTheme="majorBidi" w:cstheme="majorBidi"/>
-                <w:lang w:val="fr-FR"/>
-              </w:rPr>
-              <w:t>Clinics</w:t>
-            </w:r>
-            <w:proofErr w:type="spellEnd"/>
-            <w:r>
-              <w:rPr>
-                <w:rFonts w:asciiTheme="majorBidi" w:hAnsiTheme="majorBidi" w:cstheme="majorBidi"/>
-                <w:lang w:val="fr-FR"/>
-              </w:rPr>
-              <w:t xml:space="preserve"> data</w:t>
-            </w:r>
-          </w:p>
-        </w:tc>
-        <w:tc>
-          <w:tcPr>
-            <w:tcW w:w="805" w:type="dxa"/>
-            <w:vAlign w:val="center"/>
-          </w:tcPr>
-          <w:p>
-            <w:pPr>
-              <w:jc w:val="center"/>
-              <w:rPr>
-                <w:rFonts w:asciiTheme="majorBidi" w:hAnsiTheme="majorBidi" w:cstheme="majorBidi"/>
-                <w:lang w:val="fr-FR"/>
-              </w:rPr>
-            </w:pPr>
-          </w:p>
-        </w:tc>
-      </w:tr>
-      <w:tr>
-        <w:trPr>
-          <w:trHeight w:val="397"/>
-        </w:trPr>
-        <w:tc>
-          <w:tcPr>
-            <w:tcW w:w="1870" w:type="dxa"/>
-          </w:tcPr>
-          <w:p>
-            <w:pPr>
+            <w:tcW w:w="2136" w:type="dxa"/>
+          </w:tcPr>
+          <w:p>
+            <w:pPr>
+              <w:jc w:val="center"/>
               <w:rPr>
                 <w:rFonts w:asciiTheme="majorBidi" w:hAnsiTheme="majorBidi" w:cstheme="majorBidi"/>
                 <w:lang w:val="fr-FR"/>
@@ -516,7 +383,7 @@
         </w:tc>
         <w:tc>
           <w:tcPr>
-            <w:tcW w:w="6820" w:type="dxa"/>
+            <w:tcW w:w="6555" w:type="dxa"/>
             <w:vAlign w:val="center"/>
           </w:tcPr>
           <w:p>
@@ -539,7 +406,7 @@
         </w:tc>
         <w:tc>
           <w:tcPr>
-            <w:tcW w:w="805" w:type="dxa"/>
+            <w:tcW w:w="804" w:type="dxa"/>
             <w:vAlign w:val="center"/>
           </w:tcPr>
           <w:p>
@@ -569,10 +436,11 @@
         </w:trPr>
         <w:tc>
           <w:tcPr>
-            <w:tcW w:w="1870" w:type="dxa"/>
-          </w:tcPr>
-          <w:p>
-            <w:pPr>
+            <w:tcW w:w="2136" w:type="dxa"/>
+          </w:tcPr>
+          <w:p>
+            <w:pPr>
+              <w:jc w:val="center"/>
               <w:rPr>
                 <w:rFonts w:asciiTheme="majorBidi" w:hAnsiTheme="majorBidi" w:cstheme="majorBidi"/>
                 <w:lang w:val="fr-FR"/>
@@ -589,21 +457,28 @@
         </w:tc>
         <w:tc>
           <w:tcPr>
-            <w:tcW w:w="6820" w:type="dxa"/>
-            <w:vAlign w:val="center"/>
-          </w:tcPr>
-          <w:p>
-            <w:pPr>
-              <w:rPr>
-                <w:rFonts w:asciiTheme="majorBidi" w:hAnsiTheme="majorBidi" w:cstheme="majorBidi"/>
-                <w:lang w:val="fr-FR"/>
-              </w:rPr>
-            </w:pPr>
-          </w:p>
-        </w:tc>
-        <w:tc>
-          <w:tcPr>
-            <w:tcW w:w="805" w:type="dxa"/>
+            <w:tcW w:w="6555" w:type="dxa"/>
+            <w:vAlign w:val="center"/>
+          </w:tcPr>
+          <w:p>
+            <w:pPr>
+              <w:rPr>
+                <w:rFonts w:asciiTheme="majorBidi" w:hAnsiTheme="majorBidi" w:cstheme="majorBidi"/>
+                <w:lang w:val="fr-FR"/>
+              </w:rPr>
+            </w:pPr>
+            <w:r>
+              <w:rPr>
+                <w:rFonts w:asciiTheme="majorBidi" w:hAnsiTheme="majorBidi" w:cstheme="majorBidi"/>
+                <w:lang w:val="fr-FR"/>
+              </w:rPr>
+              <w:t xml:space="preserve">Casablanca Districts </w:t>
+            </w:r>
+          </w:p>
+        </w:tc>
+        <w:tc>
+          <w:tcPr>
+            <w:tcW w:w="804" w:type="dxa"/>
             <w:vAlign w:val="center"/>
           </w:tcPr>
           <w:p>
@@ -633,10 +508,11 @@
         </w:trPr>
         <w:tc>
           <w:tcPr>
-            <w:tcW w:w="1870" w:type="dxa"/>
-          </w:tcPr>
-          <w:p>
-            <w:pPr>
+            <w:tcW w:w="2136" w:type="dxa"/>
+          </w:tcPr>
+          <w:p>
+            <w:pPr>
+              <w:jc w:val="center"/>
               <w:rPr>
                 <w:rFonts w:asciiTheme="majorBidi" w:hAnsiTheme="majorBidi" w:cstheme="majorBidi"/>
                 <w:lang w:val="fr-FR"/>
@@ -647,63 +523,26 @@
                 <w:rFonts w:asciiTheme="majorBidi" w:hAnsiTheme="majorBidi" w:cstheme="majorBidi"/>
                 <w:lang w:val="fr-FR"/>
               </w:rPr>
-              <w:t>CASAWAY (</w:t>
+              <w:t>CASAWAY (Busway/Tramway)</w:t>
             </w:r>
-            <w:proofErr w:type="spellStart"/>
+          </w:p>
+        </w:tc>
+        <w:tc>
+          <w:tcPr>
+            <w:tcW w:w="6555" w:type="dxa"/>
+            <w:vAlign w:val="center"/>
+          </w:tcPr>
+          <w:p>
+            <w:pPr>
+              <w:rPr>
+                <w:rFonts w:asciiTheme="majorBidi" w:hAnsiTheme="majorBidi" w:cstheme="majorBidi"/>
+              </w:rPr>
+            </w:pPr>
             <w:r>
               <w:rPr>
                 <w:rFonts w:asciiTheme="majorBidi" w:hAnsiTheme="majorBidi" w:cstheme="majorBidi"/>
-                <w:lang w:val="fr-FR"/>
-              </w:rPr>
-              <w:t>Busway</w:t>
-            </w:r>
-            <w:proofErr w:type="spellEnd"/>
-            <w:r>
-              <w:rPr>
-                <w:rFonts w:asciiTheme="majorBidi" w:hAnsiTheme="majorBidi" w:cstheme="majorBidi"/>
-                <w:lang w:val="fr-FR"/>
-              </w:rPr>
-              <w:t>/Tramway)</w:t>
-            </w:r>
-          </w:p>
-        </w:tc>
-        <w:tc>
-          <w:tcPr>
-            <w:tcW w:w="6820" w:type="dxa"/>
-            <w:vAlign w:val="center"/>
-          </w:tcPr>
-          <w:p>
-            <w:pPr>
-              <w:rPr>
-                <w:rFonts w:asciiTheme="majorBidi" w:hAnsiTheme="majorBidi" w:cstheme="majorBidi"/>
-              </w:rPr>
-            </w:pPr>
-            <w:r>
-              <w:rPr>
-                <w:rFonts w:asciiTheme="majorBidi" w:hAnsiTheme="majorBidi" w:cstheme="majorBidi"/>
-              </w:rPr>
-              <w:t xml:space="preserve">Schedules of </w:t>
-            </w:r>
-            <w:proofErr w:type="spellStart"/>
-            <w:r>
-              <w:rPr>
-                <w:rFonts w:asciiTheme="majorBidi" w:hAnsiTheme="majorBidi" w:cstheme="majorBidi"/>
-              </w:rPr>
-              <w:t>BusWay</w:t>
-            </w:r>
-            <w:proofErr w:type="spellEnd"/>
-            <w:r>
-              <w:rPr>
-                <w:rFonts w:asciiTheme="majorBidi" w:hAnsiTheme="majorBidi" w:cstheme="majorBidi"/>
-              </w:rPr>
-              <w:t xml:space="preserve"> and </w:t>
-            </w:r>
-            <w:proofErr w:type="spellStart"/>
-            <w:r>
-              <w:rPr>
-                <w:rFonts w:asciiTheme="majorBidi" w:hAnsiTheme="majorBidi" w:cstheme="majorBidi"/>
-              </w:rPr>
-              <w:t>T</w:t>
+              </w:rPr>
+              <w:t>Schedules of BusWay and T</w:t>
             </w:r>
             <w:r>
               <w:rPr>
@@ -711,12 +550,11 @@
               </w:rPr>
               <w:t>ramWay</w:t>
             </w:r>
-            <w:proofErr w:type="spellEnd"/>
-          </w:p>
-        </w:tc>
-        <w:tc>
-          <w:tcPr>
-            <w:tcW w:w="805" w:type="dxa"/>
+          </w:p>
+        </w:tc>
+        <w:tc>
+          <w:tcPr>
+            <w:tcW w:w="804" w:type="dxa"/>
             <w:vAlign w:val="center"/>
           </w:tcPr>
           <w:p>
@@ -746,10 +584,11 @@
         </w:trPr>
         <w:tc>
           <w:tcPr>
-            <w:tcW w:w="1870" w:type="dxa"/>
-          </w:tcPr>
-          <w:p>
-            <w:pPr>
+            <w:tcW w:w="2136" w:type="dxa"/>
+          </w:tcPr>
+          <w:p>
+            <w:pPr>
+              <w:jc w:val="center"/>
               <w:rPr>
                 <w:rFonts w:asciiTheme="majorBidi" w:hAnsiTheme="majorBidi" w:cstheme="majorBidi"/>
                 <w:lang w:val="fr-FR"/>
@@ -766,7 +605,7 @@
         </w:tc>
         <w:tc>
           <w:tcPr>
-            <w:tcW w:w="6820" w:type="dxa"/>
+            <w:tcW w:w="6555" w:type="dxa"/>
             <w:vAlign w:val="center"/>
           </w:tcPr>
           <w:p>
@@ -781,22 +620,13 @@
                 <w:rFonts w:asciiTheme="majorBidi" w:hAnsiTheme="majorBidi" w:cstheme="majorBidi"/>
                 <w:lang w:val="fr-FR"/>
               </w:rPr>
-              <w:t xml:space="preserve">Stops of </w:t>
+              <w:t>Stops of CasaBus</w:t>
             </w:r>
-            <w:proofErr w:type="spellStart"/>
-            <w:r>
-              <w:rPr>
-                <w:rFonts w:asciiTheme="majorBidi" w:hAnsiTheme="majorBidi" w:cstheme="majorBidi"/>
-                <w:lang w:val="fr-FR"/>
-              </w:rPr>
-              <w:t>CasaBus</w:t>
-            </w:r>
-            <w:proofErr w:type="spellEnd"/>
-          </w:p>
-        </w:tc>
-        <w:tc>
-          <w:tcPr>
-            <w:tcW w:w="805" w:type="dxa"/>
+          </w:p>
+        </w:tc>
+        <w:tc>
+          <w:tcPr>
+            <w:tcW w:w="804" w:type="dxa"/>
             <w:vAlign w:val="center"/>
           </w:tcPr>
           <w:p>
@@ -826,44 +656,63 @@
         </w:trPr>
         <w:tc>
           <w:tcPr>
-            <w:tcW w:w="1870" w:type="dxa"/>
-          </w:tcPr>
-          <w:p>
-            <w:pPr>
-              <w:rPr>
-                <w:rFonts w:asciiTheme="majorBidi" w:hAnsiTheme="majorBidi" w:cstheme="majorBidi"/>
-                <w:lang w:val="fr-FR"/>
-              </w:rPr>
-            </w:pPr>
-          </w:p>
-        </w:tc>
-        <w:tc>
-          <w:tcPr>
-            <w:tcW w:w="6820" w:type="dxa"/>
-            <w:vAlign w:val="center"/>
-          </w:tcPr>
-          <w:p>
-            <w:pPr>
-              <w:rPr>
-                <w:rFonts w:asciiTheme="majorBidi" w:hAnsiTheme="majorBidi" w:cstheme="majorBidi"/>
-                <w:lang w:val="fr-FR"/>
-              </w:rPr>
-            </w:pPr>
-          </w:p>
-        </w:tc>
-        <w:tc>
-          <w:tcPr>
-            <w:tcW w:w="805" w:type="dxa"/>
-            <w:vAlign w:val="center"/>
-          </w:tcPr>
-          <w:p>
-            <w:pPr>
-              <w:jc w:val="center"/>
-              <w:rPr>
-                <w:rFonts w:asciiTheme="majorBidi" w:hAnsiTheme="majorBidi" w:cstheme="majorBidi"/>
-                <w:lang w:val="fr-FR"/>
-              </w:rPr>
-            </w:pPr>
+            <w:tcW w:w="2136" w:type="dxa"/>
+          </w:tcPr>
+          <w:p>
+            <w:pPr>
+              <w:jc w:val="center"/>
+              <w:rPr>
+                <w:rFonts w:asciiTheme="majorBidi" w:hAnsiTheme="majorBidi" w:cstheme="majorBidi"/>
+                <w:lang w:val="fr-FR"/>
+              </w:rPr>
+            </w:pPr>
+            <w:r>
+              <w:rPr>
+                <w:rFonts w:asciiTheme="majorBidi" w:hAnsiTheme="majorBidi" w:cstheme="majorBidi"/>
+                <w:lang w:val="fr-FR"/>
+              </w:rPr>
+              <w:t>HCP</w:t>
+            </w:r>
+          </w:p>
+        </w:tc>
+        <w:tc>
+          <w:tcPr>
+            <w:tcW w:w="6555" w:type="dxa"/>
+            <w:vAlign w:val="center"/>
+          </w:tcPr>
+          <w:p>
+            <w:pPr>
+              <w:rPr>
+                <w:rFonts w:asciiTheme="majorBidi" w:hAnsiTheme="majorBidi" w:cstheme="majorBidi"/>
+                <w:lang w:val="fr-FR"/>
+              </w:rPr>
+            </w:pPr>
+            <w:r>
+              <w:rPr>
+                <w:rFonts w:asciiTheme="majorBidi" w:hAnsiTheme="majorBidi" w:cstheme="majorBidi"/>
+                <w:lang w:val="fr-FR"/>
+              </w:rPr>
+              <w:t>Population by Commune</w:t>
+            </w:r>
+          </w:p>
+        </w:tc>
+        <w:tc>
+          <w:tcPr>
+            <w:tcW w:w="804" w:type="dxa"/>
+            <w:vAlign w:val="center"/>
+          </w:tcPr>
+          <w:p>
+            <w:pPr>
+              <w:jc w:val="center"/>
+            </w:pPr>
+            <w:hyperlink r:id="rId11" w:history="1">
+              <w:r>
+                <w:rPr>
+                  <w:rStyle w:val="Hyperlink"/>
+                </w:rPr>
+                <w:t>hcp</w:t>
+              </w:r>
+            </w:hyperlink>
           </w:p>
         </w:tc>
       </w:tr>
@@ -873,43 +722,40 @@
         </w:trPr>
         <w:tc>
           <w:tcPr>
-            <w:tcW w:w="1870" w:type="dxa"/>
-          </w:tcPr>
-          <w:p>
-            <w:pPr>
-              <w:rPr>
-                <w:rFonts w:asciiTheme="majorBidi" w:hAnsiTheme="majorBidi" w:cstheme="majorBidi"/>
-                <w:lang w:val="fr-FR"/>
-              </w:rPr>
-            </w:pPr>
-          </w:p>
-        </w:tc>
-        <w:tc>
-          <w:tcPr>
-            <w:tcW w:w="6820" w:type="dxa"/>
-            <w:vAlign w:val="center"/>
-          </w:tcPr>
-          <w:p>
-            <w:pPr>
-              <w:rPr>
-                <w:rFonts w:asciiTheme="majorBidi" w:hAnsiTheme="majorBidi" w:cstheme="majorBidi"/>
-                <w:lang w:val="fr-FR"/>
-              </w:rPr>
-            </w:pPr>
-          </w:p>
-        </w:tc>
-        <w:tc>
-          <w:tcPr>
-            <w:tcW w:w="805" w:type="dxa"/>
-            <w:vAlign w:val="center"/>
-          </w:tcPr>
-          <w:p>
-            <w:pPr>
-              <w:jc w:val="center"/>
-              <w:rPr>
-                <w:rFonts w:asciiTheme="majorBidi" w:hAnsiTheme="majorBidi" w:cstheme="majorBidi"/>
-                <w:lang w:val="fr-FR"/>
-              </w:rPr>
+            <w:tcW w:w="2136" w:type="dxa"/>
+          </w:tcPr>
+          <w:p>
+            <w:pPr>
+              <w:jc w:val="center"/>
+              <w:rPr>
+                <w:rFonts w:asciiTheme="majorBidi" w:hAnsiTheme="majorBidi" w:cstheme="majorBidi"/>
+                <w:lang w:val="fr-FR"/>
+              </w:rPr>
+            </w:pPr>
+          </w:p>
+        </w:tc>
+        <w:tc>
+          <w:tcPr>
+            <w:tcW w:w="6555" w:type="dxa"/>
+            <w:vAlign w:val="center"/>
+          </w:tcPr>
+          <w:p>
+            <w:pPr>
+              <w:rPr>
+                <w:rFonts w:asciiTheme="majorBidi" w:hAnsiTheme="majorBidi" w:cstheme="majorBidi"/>
+                <w:lang w:val="fr-FR"/>
+              </w:rPr>
+            </w:pPr>
+          </w:p>
+        </w:tc>
+        <w:tc>
+          <w:tcPr>
+            <w:tcW w:w="804" w:type="dxa"/>
+            <w:vAlign w:val="center"/>
+          </w:tcPr>
+          <w:p>
+            <w:pPr>
+              <w:jc w:val="center"/>
             </w:pPr>
           </w:p>
         </w:tc>
@@ -920,43 +766,40 @@
         </w:trPr>
         <w:tc>
           <w:tcPr>
-            <w:tcW w:w="1870" w:type="dxa"/>
-          </w:tcPr>
-          <w:p>
-            <w:pPr>
-              <w:rPr>
-                <w:rFonts w:asciiTheme="majorBidi" w:hAnsiTheme="majorBidi" w:cstheme="majorBidi"/>
-                <w:lang w:val="fr-FR"/>
-              </w:rPr>
-            </w:pPr>
-          </w:p>
-        </w:tc>
-        <w:tc>
-          <w:tcPr>
-            <w:tcW w:w="6820" w:type="dxa"/>
-            <w:vAlign w:val="center"/>
-          </w:tcPr>
-          <w:p>
-            <w:pPr>
-              <w:rPr>
-                <w:rFonts w:asciiTheme="majorBidi" w:hAnsiTheme="majorBidi" w:cstheme="majorBidi"/>
-                <w:lang w:val="fr-FR"/>
-              </w:rPr>
-            </w:pPr>
-          </w:p>
-        </w:tc>
-        <w:tc>
-          <w:tcPr>
-            <w:tcW w:w="805" w:type="dxa"/>
-            <w:vAlign w:val="center"/>
-          </w:tcPr>
-          <w:p>
-            <w:pPr>
-              <w:jc w:val="center"/>
-              <w:rPr>
-                <w:rFonts w:asciiTheme="majorBidi" w:hAnsiTheme="majorBidi" w:cstheme="majorBidi"/>
-                <w:lang w:val="fr-FR"/>
-              </w:rPr>
+            <w:tcW w:w="2136" w:type="dxa"/>
+          </w:tcPr>
+          <w:p>
+            <w:pPr>
+              <w:jc w:val="center"/>
+              <w:rPr>
+                <w:rFonts w:asciiTheme="majorBidi" w:hAnsiTheme="majorBidi" w:cstheme="majorBidi"/>
+                <w:lang w:val="fr-FR"/>
+              </w:rPr>
+            </w:pPr>
+          </w:p>
+        </w:tc>
+        <w:tc>
+          <w:tcPr>
+            <w:tcW w:w="6555" w:type="dxa"/>
+            <w:vAlign w:val="center"/>
+          </w:tcPr>
+          <w:p>
+            <w:pPr>
+              <w:rPr>
+                <w:rFonts w:asciiTheme="majorBidi" w:hAnsiTheme="majorBidi" w:cstheme="majorBidi"/>
+                <w:lang w:val="fr-FR"/>
+              </w:rPr>
+            </w:pPr>
+          </w:p>
+        </w:tc>
+        <w:tc>
+          <w:tcPr>
+            <w:tcW w:w="804" w:type="dxa"/>
+            <w:vAlign w:val="center"/>
+          </w:tcPr>
+          <w:p>
+            <w:pPr>
+              <w:jc w:val="center"/>
             </w:pPr>
           </w:p>
         </w:tc>
@@ -967,43 +810,40 @@
         </w:trPr>
         <w:tc>
           <w:tcPr>
-            <w:tcW w:w="1870" w:type="dxa"/>
-          </w:tcPr>
-          <w:p>
-            <w:pPr>
-              <w:rPr>
-                <w:rFonts w:asciiTheme="majorBidi" w:hAnsiTheme="majorBidi" w:cstheme="majorBidi"/>
-                <w:lang w:val="fr-FR"/>
-              </w:rPr>
-            </w:pPr>
-          </w:p>
-        </w:tc>
-        <w:tc>
-          <w:tcPr>
-            <w:tcW w:w="6820" w:type="dxa"/>
-            <w:vAlign w:val="center"/>
-          </w:tcPr>
-          <w:p>
-            <w:pPr>
-              <w:rPr>
-                <w:rFonts w:asciiTheme="majorBidi" w:hAnsiTheme="majorBidi" w:cstheme="majorBidi"/>
-                <w:lang w:val="fr-FR"/>
-              </w:rPr>
-            </w:pPr>
-          </w:p>
-        </w:tc>
-        <w:tc>
-          <w:tcPr>
-            <w:tcW w:w="805" w:type="dxa"/>
-            <w:vAlign w:val="center"/>
-          </w:tcPr>
-          <w:p>
-            <w:pPr>
-              <w:jc w:val="center"/>
-              <w:rPr>
-                <w:rFonts w:asciiTheme="majorBidi" w:hAnsiTheme="majorBidi" w:cstheme="majorBidi"/>
-                <w:lang w:val="fr-FR"/>
-              </w:rPr>
+            <w:tcW w:w="2136" w:type="dxa"/>
+          </w:tcPr>
+          <w:p>
+            <w:pPr>
+              <w:jc w:val="center"/>
+              <w:rPr>
+                <w:rFonts w:asciiTheme="majorBidi" w:hAnsiTheme="majorBidi" w:cstheme="majorBidi"/>
+                <w:lang w:val="fr-FR"/>
+              </w:rPr>
+            </w:pPr>
+          </w:p>
+        </w:tc>
+        <w:tc>
+          <w:tcPr>
+            <w:tcW w:w="6555" w:type="dxa"/>
+            <w:vAlign w:val="center"/>
+          </w:tcPr>
+          <w:p>
+            <w:pPr>
+              <w:rPr>
+                <w:rFonts w:asciiTheme="majorBidi" w:hAnsiTheme="majorBidi" w:cstheme="majorBidi"/>
+                <w:lang w:val="fr-FR"/>
+              </w:rPr>
+            </w:pPr>
+          </w:p>
+        </w:tc>
+        <w:tc>
+          <w:tcPr>
+            <w:tcW w:w="804" w:type="dxa"/>
+            <w:vAlign w:val="center"/>
+          </w:tcPr>
+          <w:p>
+            <w:pPr>
+              <w:jc w:val="center"/>
             </w:pPr>
           </w:p>
         </w:tc>
@@ -1014,43 +854,40 @@
         </w:trPr>
         <w:tc>
           <w:tcPr>
-            <w:tcW w:w="1870" w:type="dxa"/>
-          </w:tcPr>
-          <w:p>
-            <w:pPr>
-              <w:rPr>
-                <w:rFonts w:asciiTheme="majorBidi" w:hAnsiTheme="majorBidi" w:cstheme="majorBidi"/>
-                <w:lang w:val="fr-FR"/>
-              </w:rPr>
-            </w:pPr>
-          </w:p>
-        </w:tc>
-        <w:tc>
-          <w:tcPr>
-            <w:tcW w:w="6820" w:type="dxa"/>
-            <w:vAlign w:val="center"/>
-          </w:tcPr>
-          <w:p>
-            <w:pPr>
-              <w:rPr>
-                <w:rFonts w:asciiTheme="majorBidi" w:hAnsiTheme="majorBidi" w:cstheme="majorBidi"/>
-                <w:lang w:val="fr-FR"/>
-              </w:rPr>
-            </w:pPr>
-          </w:p>
-        </w:tc>
-        <w:tc>
-          <w:tcPr>
-            <w:tcW w:w="805" w:type="dxa"/>
-            <w:vAlign w:val="center"/>
-          </w:tcPr>
-          <w:p>
-            <w:pPr>
-              <w:jc w:val="center"/>
-              <w:rPr>
-                <w:rFonts w:asciiTheme="majorBidi" w:hAnsiTheme="majorBidi" w:cstheme="majorBidi"/>
-                <w:lang w:val="fr-FR"/>
-              </w:rPr>
+            <w:tcW w:w="2136" w:type="dxa"/>
+          </w:tcPr>
+          <w:p>
+            <w:pPr>
+              <w:jc w:val="center"/>
+              <w:rPr>
+                <w:rFonts w:asciiTheme="majorBidi" w:hAnsiTheme="majorBidi" w:cstheme="majorBidi"/>
+                <w:lang w:val="fr-FR"/>
+              </w:rPr>
+            </w:pPr>
+          </w:p>
+        </w:tc>
+        <w:tc>
+          <w:tcPr>
+            <w:tcW w:w="6555" w:type="dxa"/>
+            <w:vAlign w:val="center"/>
+          </w:tcPr>
+          <w:p>
+            <w:pPr>
+              <w:rPr>
+                <w:rFonts w:asciiTheme="majorBidi" w:hAnsiTheme="majorBidi" w:cstheme="majorBidi"/>
+                <w:lang w:val="fr-FR"/>
+              </w:rPr>
+            </w:pPr>
+          </w:p>
+        </w:tc>
+        <w:tc>
+          <w:tcPr>
+            <w:tcW w:w="804" w:type="dxa"/>
+            <w:vAlign w:val="center"/>
+          </w:tcPr>
+          <w:p>
+            <w:pPr>
+              <w:jc w:val="center"/>
             </w:pPr>
           </w:p>
         </w:tc>
@@ -1061,43 +898,40 @@
         </w:trPr>
         <w:tc>
           <w:tcPr>
-            <w:tcW w:w="1870" w:type="dxa"/>
-          </w:tcPr>
-          <w:p>
-            <w:pPr>
-              <w:rPr>
-                <w:rFonts w:asciiTheme="majorBidi" w:hAnsiTheme="majorBidi" w:cstheme="majorBidi"/>
-                <w:lang w:val="fr-FR"/>
-              </w:rPr>
-            </w:pPr>
-          </w:p>
-        </w:tc>
-        <w:tc>
-          <w:tcPr>
-            <w:tcW w:w="6820" w:type="dxa"/>
-            <w:vAlign w:val="center"/>
-          </w:tcPr>
-          <w:p>
-            <w:pPr>
-              <w:rPr>
-                <w:rFonts w:asciiTheme="majorBidi" w:hAnsiTheme="majorBidi" w:cstheme="majorBidi"/>
-                <w:lang w:val="fr-FR"/>
-              </w:rPr>
-            </w:pPr>
-          </w:p>
-        </w:tc>
-        <w:tc>
-          <w:tcPr>
-            <w:tcW w:w="805" w:type="dxa"/>
-            <w:vAlign w:val="center"/>
-          </w:tcPr>
-          <w:p>
-            <w:pPr>
-              <w:jc w:val="center"/>
-              <w:rPr>
-                <w:rFonts w:asciiTheme="majorBidi" w:hAnsiTheme="majorBidi" w:cstheme="majorBidi"/>
-                <w:lang w:val="fr-FR"/>
-              </w:rPr>
+            <w:tcW w:w="2136" w:type="dxa"/>
+          </w:tcPr>
+          <w:p>
+            <w:pPr>
+              <w:jc w:val="center"/>
+              <w:rPr>
+                <w:rFonts w:asciiTheme="majorBidi" w:hAnsiTheme="majorBidi" w:cstheme="majorBidi"/>
+                <w:lang w:val="fr-FR"/>
+              </w:rPr>
+            </w:pPr>
+          </w:p>
+        </w:tc>
+        <w:tc>
+          <w:tcPr>
+            <w:tcW w:w="6555" w:type="dxa"/>
+            <w:vAlign w:val="center"/>
+          </w:tcPr>
+          <w:p>
+            <w:pPr>
+              <w:rPr>
+                <w:rFonts w:asciiTheme="majorBidi" w:hAnsiTheme="majorBidi" w:cstheme="majorBidi"/>
+                <w:lang w:val="fr-FR"/>
+              </w:rPr>
+            </w:pPr>
+          </w:p>
+        </w:tc>
+        <w:tc>
+          <w:tcPr>
+            <w:tcW w:w="804" w:type="dxa"/>
+            <w:vAlign w:val="center"/>
+          </w:tcPr>
+          <w:p>
+            <w:pPr>
+              <w:jc w:val="center"/>
             </w:pPr>
           </w:p>
         </w:tc>
@@ -1108,43 +942,128 @@
         </w:trPr>
         <w:tc>
           <w:tcPr>
-            <w:tcW w:w="1870" w:type="dxa"/>
-          </w:tcPr>
-          <w:p>
-            <w:pPr>
-              <w:rPr>
-                <w:rFonts w:asciiTheme="majorBidi" w:hAnsiTheme="majorBidi" w:cstheme="majorBidi"/>
-                <w:lang w:val="fr-FR"/>
-              </w:rPr>
-            </w:pPr>
-          </w:p>
-        </w:tc>
-        <w:tc>
-          <w:tcPr>
-            <w:tcW w:w="6820" w:type="dxa"/>
-            <w:vAlign w:val="center"/>
-          </w:tcPr>
-          <w:p>
-            <w:pPr>
-              <w:rPr>
-                <w:rFonts w:asciiTheme="majorBidi" w:hAnsiTheme="majorBidi" w:cstheme="majorBidi"/>
-                <w:lang w:val="fr-FR"/>
-              </w:rPr>
-            </w:pPr>
-          </w:p>
-        </w:tc>
-        <w:tc>
-          <w:tcPr>
-            <w:tcW w:w="805" w:type="dxa"/>
-            <w:vAlign w:val="center"/>
-          </w:tcPr>
-          <w:p>
-            <w:pPr>
-              <w:jc w:val="center"/>
-              <w:rPr>
-                <w:rFonts w:asciiTheme="majorBidi" w:hAnsiTheme="majorBidi" w:cstheme="majorBidi"/>
-                <w:lang w:val="fr-FR"/>
-              </w:rPr>
+            <w:tcW w:w="2136" w:type="dxa"/>
+          </w:tcPr>
+          <w:p>
+            <w:pPr>
+              <w:jc w:val="center"/>
+              <w:rPr>
+                <w:rFonts w:asciiTheme="majorBidi" w:hAnsiTheme="majorBidi" w:cstheme="majorBidi"/>
+                <w:lang w:val="fr-FR"/>
+              </w:rPr>
+            </w:pPr>
+          </w:p>
+        </w:tc>
+        <w:tc>
+          <w:tcPr>
+            <w:tcW w:w="6555" w:type="dxa"/>
+            <w:vAlign w:val="center"/>
+          </w:tcPr>
+          <w:p>
+            <w:pPr>
+              <w:rPr>
+                <w:rFonts w:asciiTheme="majorBidi" w:hAnsiTheme="majorBidi" w:cstheme="majorBidi"/>
+                <w:lang w:val="fr-FR"/>
+              </w:rPr>
+            </w:pPr>
+          </w:p>
+        </w:tc>
+        <w:tc>
+          <w:tcPr>
+            <w:tcW w:w="804" w:type="dxa"/>
+            <w:vAlign w:val="center"/>
+          </w:tcPr>
+          <w:p>
+            <w:pPr>
+              <w:jc w:val="center"/>
+            </w:pPr>
+          </w:p>
+        </w:tc>
+      </w:tr>
+      <w:tr>
+        <w:trPr>
+          <w:trHeight w:val="397"/>
+        </w:trPr>
+        <w:tc>
+          <w:tcPr>
+            <w:tcW w:w="2136" w:type="dxa"/>
+          </w:tcPr>
+          <w:p>
+            <w:pPr>
+              <w:jc w:val="center"/>
+              <w:rPr>
+                <w:rFonts w:asciiTheme="majorBidi" w:hAnsiTheme="majorBidi" w:cstheme="majorBidi"/>
+                <w:lang w:val="fr-FR"/>
+              </w:rPr>
+            </w:pPr>
+          </w:p>
+        </w:tc>
+        <w:tc>
+          <w:tcPr>
+            <w:tcW w:w="6555" w:type="dxa"/>
+            <w:vAlign w:val="center"/>
+          </w:tcPr>
+          <w:p>
+            <w:pPr>
+              <w:rPr>
+                <w:rFonts w:asciiTheme="majorBidi" w:hAnsiTheme="majorBidi" w:cstheme="majorBidi"/>
+                <w:lang w:val="fr-FR"/>
+              </w:rPr>
+            </w:pPr>
+          </w:p>
+        </w:tc>
+        <w:tc>
+          <w:tcPr>
+            <w:tcW w:w="804" w:type="dxa"/>
+            <w:vAlign w:val="center"/>
+          </w:tcPr>
+          <w:p>
+            <w:pPr>
+              <w:jc w:val="center"/>
+            </w:pPr>
+          </w:p>
+        </w:tc>
+      </w:tr>
+      <w:tr>
+        <w:trPr>
+          <w:trHeight w:val="397"/>
+        </w:trPr>
+        <w:tc>
+          <w:tcPr>
+            <w:tcW w:w="2136" w:type="dxa"/>
+          </w:tcPr>
+          <w:p>
+            <w:pPr>
+              <w:jc w:val="center"/>
+              <w:rPr>
+                <w:rFonts w:asciiTheme="majorBidi" w:hAnsiTheme="majorBidi" w:cstheme="majorBidi"/>
+                <w:lang w:val="fr-FR"/>
+              </w:rPr>
+            </w:pPr>
+          </w:p>
+        </w:tc>
+        <w:tc>
+          <w:tcPr>
+            <w:tcW w:w="6555" w:type="dxa"/>
+            <w:vAlign w:val="center"/>
+          </w:tcPr>
+          <w:p>
+            <w:pPr>
+              <w:rPr>
+                <w:rFonts w:asciiTheme="majorBidi" w:hAnsiTheme="majorBidi" w:cstheme="majorBidi"/>
+                <w:lang w:val="fr-FR"/>
+              </w:rPr>
+            </w:pPr>
+          </w:p>
+        </w:tc>
+        <w:tc>
+          <w:tcPr>
+            <w:tcW w:w="804" w:type="dxa"/>
+            <w:vAlign w:val="center"/>
+          </w:tcPr>
+          <w:p>
+            <w:pPr>
+              <w:jc w:val="center"/>
             </w:pPr>
           </w:p>
         </w:tc>
@@ -1156,6 +1075,144 @@
           <w:lang w:val="fr-FR"/>
         </w:rPr>
       </w:pPr>
+    </w:p>
+    <w:p>
+      <w:pPr>
+        <w:rPr>
+          <w:lang w:val="fr-FR"/>
+        </w:rPr>
+      </w:pPr>
+    </w:p>
+    <w:p>
+      <w:pPr>
+        <w:rPr>
+          <w:lang w:val="fr-FR"/>
+        </w:rPr>
+      </w:pPr>
+    </w:p>
+    <w:p>
+      <w:r>
+        <w:t>Casablanca Administrative boundaries :</w:t>
+      </w:r>
+    </w:p>
+    <w:p>
+      <w:r>
+        <w:t>Anfa</w:t>
+      </w:r>
+      <w:r>
+        <w:t xml:space="preserve"> [</w:t>
+      </w:r>
+      <w:r>
+        <w:rPr>
+          <w:i/>
+          <w:iCs/>
+        </w:rPr>
+        <w:t>Derb Sultan</w:t>
+      </w:r>
+      <w:r>
+        <w:t>, Anfa, El Maarif, Sidi Belyout, Ben Chentouf, Al Idrissia]</w:t>
+      </w:r>
+      <w:r>
+        <w:t xml:space="preserve">, </w:t>
+      </w:r>
+    </w:p>
+    <w:p>
+      <w:pPr>
+        <w:rPr>
+          <w:lang w:val="fr-FR"/>
+        </w:rPr>
+      </w:pPr>
+      <w:r>
+        <w:rPr>
+          <w:lang w:val="fr-FR"/>
+        </w:rPr>
+        <w:t>Sidi Bernoussi</w:t>
+      </w:r>
+      <w:r>
+        <w:rPr>
+          <w:lang w:val="fr-FR"/>
+        </w:rPr>
+        <w:t xml:space="preserve"> [Sidi Bernoussi, Sidi Moumen]</w:t>
+      </w:r>
+      <w:r>
+        <w:rPr>
+          <w:lang w:val="fr-FR"/>
+        </w:rPr>
+        <w:t xml:space="preserve">, </w:t>
+      </w:r>
+    </w:p>
+    <w:p>
+      <w:r>
+        <w:t>Ain Sbaa-Hay Mohammedi</w:t>
+      </w:r>
+      <w:r>
+        <w:t xml:space="preserve"> [Ain Sebaa, Hay Mohammadi, Assoukhour Assawda]</w:t>
+      </w:r>
+      <w:r>
+        <w:t xml:space="preserve">, </w:t>
+      </w:r>
+    </w:p>
+    <w:p>
+      <w:r>
+        <w:t>Al Fida-Mers Sultan</w:t>
+      </w:r>
+      <w:r>
+        <w:t xml:space="preserve"> [Al Fida, Mers Sultan, Mechouar Casablanca]</w:t>
+      </w:r>
+      <w:r>
+        <w:t xml:space="preserve">, </w:t>
+      </w:r>
+    </w:p>
+    <w:p>
+      <w:r>
+        <w:t>Moulay Rachid</w:t>
+      </w:r>
+      <w:r>
+        <w:t xml:space="preserve"> [Moulay Rachid, </w:t>
+      </w:r>
+      <w:r>
+        <w:rPr>
+          <w:i/>
+          <w:iCs/>
+        </w:rPr>
+        <w:t>Sidi Othmane</w:t>
+      </w:r>
+      <w:r>
+        <w:t>]</w:t>
+      </w:r>
+      <w:r>
+        <w:t xml:space="preserve">, </w:t>
+      </w:r>
+    </w:p>
+    <w:p>
+      <w:r>
+        <w:t>Ain Chock</w:t>
+      </w:r>
+      <w:r>
+        <w:t xml:space="preserve"> [Ain Chock]</w:t>
+      </w:r>
+      <w:r>
+        <w:t xml:space="preserve">, </w:t>
+      </w:r>
+    </w:p>
+    <w:p>
+      <w:r>
+        <w:t>Ben M'Sick-Sidi Othmane</w:t>
+      </w:r>
+      <w:r>
+        <w:t xml:space="preserve"> [Ben M’Sick, Sbata]</w:t>
+      </w:r>
+      <w:r>
+        <w:t xml:space="preserve">, </w:t>
+      </w:r>
+    </w:p>
+    <w:p>
+      <w:r>
+        <w:t>Hay Hassani</w:t>
+      </w:r>
+      <w:r>
+        <w:t xml:space="preserve"> [Hay Hassani]</w:t>
+      </w:r>
     </w:p>
     <w:sectPr>
       <w:pgSz w:w="11906" w:h="16838"/>
@@ -1769,7 +1826,6 @@
   <w:style w:type="character" w:default="1" w:styleId="DefaultParagraphFont">
     <w:name w:val="Default Paragraph Font"/>
     <w:uiPriority w:val="1"/>
-    <w:semiHidden/>
     <w:unhideWhenUsed/>
   </w:style>
   <w:style w:type="table" w:default="1" w:styleId="TableNormal">
@@ -2123,6 +2179,18 @@
     <w:rPr>
       <w:color w:val="605E5C"/>
       <w:shd w:val="clear" w:color="auto" w:fill="E1DFDD"/>
+    </w:rPr>
+  </w:style>
+  <w:style w:type="character" w:styleId="FollowedHyperlink">
+    <w:name w:val="FollowedHyperlink"/>
+    <w:basedOn w:val="DefaultParagraphFont"/>
+    <w:uiPriority w:val="99"/>
+    <w:semiHidden/>
+    <w:unhideWhenUsed/>
+    <w:rsid w:val="001777D6"/>
+    <w:rPr>
+      <w:color w:val="96607D" w:themeColor="followedHyperlink"/>
+      <w:u w:val="single"/>
     </w:rPr>
   </w:style>
 </w:styles>

</xml_diff>

<commit_message>
Organizing code and documentation
</commit_message>
<xml_diff>
--- a/data/Data.docx
+++ b/data/Data.docx
@@ -732,6 +732,13 @@
                 <w:lang w:val="fr-FR"/>
               </w:rPr>
             </w:pPr>
+            <w:r>
+              <w:rPr>
+                <w:rFonts w:asciiTheme="majorBidi" w:hAnsiTheme="majorBidi" w:cstheme="majorBidi"/>
+                <w:lang w:val="fr-FR"/>
+              </w:rPr>
+              <w:t>GHSL</w:t>
+            </w:r>
           </w:p>
         </w:tc>
         <w:tc>
@@ -743,9 +750,20 @@
             <w:pPr>
               <w:rPr>
                 <w:rFonts w:asciiTheme="majorBidi" w:hAnsiTheme="majorBidi" w:cstheme="majorBidi"/>
-                <w:lang w:val="fr-FR"/>
-              </w:rPr>
-            </w:pPr>
+              </w:rPr>
+            </w:pPr>
+            <w:r>
+              <w:rPr>
+                <w:rFonts w:asciiTheme="majorBidi" w:hAnsiTheme="majorBidi" w:cstheme="majorBidi"/>
+              </w:rPr>
+              <w:t>BUILT raster for population e</w:t>
+            </w:r>
+            <w:r>
+              <w:rPr>
+                <w:rFonts w:asciiTheme="majorBidi" w:hAnsiTheme="majorBidi" w:cstheme="majorBidi"/>
+              </w:rPr>
+              <w:t>stimation</w:t>
+            </w:r>
           </w:p>
         </w:tc>
         <w:tc>
@@ -757,6 +775,14 @@
             <w:pPr>
               <w:jc w:val="center"/>
             </w:pPr>
+            <w:hyperlink r:id="rId12" w:history="1">
+              <w:r>
+                <w:rPr>
+                  <w:rStyle w:val="Hyperlink"/>
+                </w:rPr>
+                <w:t>ghs</w:t>
+              </w:r>
+            </w:hyperlink>
           </w:p>
         </w:tc>
       </w:tr>
@@ -1153,13 +1179,27 @@
       </w:r>
     </w:p>
     <w:p>
-      <w:r>
+      <w:pPr>
+        <w:rPr>
+          <w:lang w:val="fr-FR"/>
+        </w:rPr>
+      </w:pPr>
+      <w:r>
+        <w:rPr>
+          <w:lang w:val="fr-FR"/>
+        </w:rPr>
         <w:t>Al Fida-Mers Sultan</w:t>
       </w:r>
       <w:r>
+        <w:rPr>
+          <w:lang w:val="fr-FR"/>
+        </w:rPr>
         <w:t xml:space="preserve"> [Al Fida, Mers Sultan, Mechouar Casablanca]</w:t>
       </w:r>
       <w:r>
+        <w:rPr>
+          <w:lang w:val="fr-FR"/>
+        </w:rPr>
         <w:t xml:space="preserve">, </w:t>
       </w:r>
     </w:p>
@@ -1826,6 +1866,7 @@
   <w:style w:type="character" w:default="1" w:styleId="DefaultParagraphFont">
     <w:name w:val="Default Paragraph Font"/>
     <w:uiPriority w:val="1"/>
+    <w:semiHidden/>
     <w:unhideWhenUsed/>
   </w:style>
   <w:style w:type="table" w:default="1" w:styleId="TableNormal">

</xml_diff>

<commit_message>
Organize code; Data Analysis
</commit_message>
<xml_diff>
--- a/data/Data.docx
+++ b/data/Data.docx
@@ -193,7 +193,43 @@
                 <w:b/>
                 <w:bCs/>
               </w:rPr>
-              <w:t>La liste des hôpitaux 2022</w:t>
+              <w:t xml:space="preserve">La </w:t>
+            </w:r>
+            <w:proofErr w:type="spellStart"/>
+            <w:r>
+              <w:rPr>
+                <w:rFonts w:asciiTheme="majorBidi" w:hAnsiTheme="majorBidi" w:cstheme="majorBidi"/>
+                <w:b/>
+                <w:bCs/>
+              </w:rPr>
+              <w:t>liste</w:t>
+            </w:r>
+            <w:proofErr w:type="spellEnd"/>
+            <w:r>
+              <w:rPr>
+                <w:rFonts w:asciiTheme="majorBidi" w:hAnsiTheme="majorBidi" w:cstheme="majorBidi"/>
+                <w:b/>
+                <w:bCs/>
+              </w:rPr>
+              <w:t xml:space="preserve"> des </w:t>
+            </w:r>
+            <w:proofErr w:type="spellStart"/>
+            <w:r>
+              <w:rPr>
+                <w:rFonts w:asciiTheme="majorBidi" w:hAnsiTheme="majorBidi" w:cstheme="majorBidi"/>
+                <w:b/>
+                <w:bCs/>
+              </w:rPr>
+              <w:t>hôpitaux</w:t>
+            </w:r>
+            <w:proofErr w:type="spellEnd"/>
+            <w:r>
+              <w:rPr>
+                <w:rFonts w:asciiTheme="majorBidi" w:hAnsiTheme="majorBidi" w:cstheme="majorBidi"/>
+                <w:b/>
+                <w:bCs/>
+              </w:rPr>
+              <w:t xml:space="preserve"> 2022</w:t>
             </w:r>
           </w:p>
         </w:tc>
@@ -331,12 +367,53 @@
                 <w:lang w:val="fr-FR"/>
               </w:rPr>
             </w:pPr>
-            <w:r>
-              <w:rPr>
-                <w:rFonts w:asciiTheme="majorBidi" w:hAnsiTheme="majorBidi" w:cstheme="majorBidi"/>
-                <w:lang w:val="fr-FR"/>
-              </w:rPr>
-              <w:t>Amenity : Hospitals &amp; Clinics data</w:t>
+            <w:proofErr w:type="spellStart"/>
+            <w:r>
+              <w:rPr>
+                <w:rFonts w:asciiTheme="majorBidi" w:hAnsiTheme="majorBidi" w:cstheme="majorBidi"/>
+                <w:lang w:val="fr-FR"/>
+              </w:rPr>
+              <w:t>Amenity</w:t>
+            </w:r>
+            <w:proofErr w:type="spellEnd"/>
+            <w:r>
+              <w:rPr>
+                <w:rFonts w:asciiTheme="majorBidi" w:hAnsiTheme="majorBidi" w:cstheme="majorBidi"/>
+                <w:lang w:val="fr-FR"/>
+              </w:rPr>
+              <w:t xml:space="preserve"> : </w:t>
+            </w:r>
+            <w:proofErr w:type="spellStart"/>
+            <w:r>
+              <w:rPr>
+                <w:rFonts w:asciiTheme="majorBidi" w:hAnsiTheme="majorBidi" w:cstheme="majorBidi"/>
+                <w:lang w:val="fr-FR"/>
+              </w:rPr>
+              <w:t>Hospitals</w:t>
+            </w:r>
+            <w:proofErr w:type="spellEnd"/>
+            <w:r>
+              <w:rPr>
+                <w:rFonts w:asciiTheme="majorBidi" w:hAnsiTheme="majorBidi" w:cstheme="majorBidi"/>
+                <w:lang w:val="fr-FR"/>
+              </w:rPr>
+              <w:t xml:space="preserve"> &amp; </w:t>
+            </w:r>
+            <w:proofErr w:type="spellStart"/>
+            <w:r>
+              <w:rPr>
+                <w:rFonts w:asciiTheme="majorBidi" w:hAnsiTheme="majorBidi" w:cstheme="majorBidi"/>
+                <w:lang w:val="fr-FR"/>
+              </w:rPr>
+              <w:t>Clinics</w:t>
+            </w:r>
+            <w:proofErr w:type="spellEnd"/>
+            <w:r>
+              <w:rPr>
+                <w:rFonts w:asciiTheme="majorBidi" w:hAnsiTheme="majorBidi" w:cstheme="majorBidi"/>
+                <w:lang w:val="fr-FR"/>
+              </w:rPr>
+              <w:t xml:space="preserve"> data</w:t>
             </w:r>
           </w:p>
         </w:tc>
@@ -523,7 +600,23 @@
                 <w:rFonts w:asciiTheme="majorBidi" w:hAnsiTheme="majorBidi" w:cstheme="majorBidi"/>
                 <w:lang w:val="fr-FR"/>
               </w:rPr>
-              <w:t>CASAWAY (Busway/Tramway)</w:t>
+              <w:t>CASAWAY (</w:t>
+            </w:r>
+            <w:proofErr w:type="spellStart"/>
+            <w:r>
+              <w:rPr>
+                <w:rFonts w:asciiTheme="majorBidi" w:hAnsiTheme="majorBidi" w:cstheme="majorBidi"/>
+                <w:lang w:val="fr-FR"/>
+              </w:rPr>
+              <w:t>Busway</w:t>
+            </w:r>
+            <w:proofErr w:type="spellEnd"/>
+            <w:r>
+              <w:rPr>
+                <w:rFonts w:asciiTheme="majorBidi" w:hAnsiTheme="majorBidi" w:cstheme="majorBidi"/>
+                <w:lang w:val="fr-FR"/>
+              </w:rPr>
+              <w:t>/Tramway)</w:t>
             </w:r>
           </w:p>
         </w:tc>
@@ -542,7 +635,28 @@
               <w:rPr>
                 <w:rFonts w:asciiTheme="majorBidi" w:hAnsiTheme="majorBidi" w:cstheme="majorBidi"/>
               </w:rPr>
-              <w:t>Schedules of BusWay and T</w:t>
+              <w:t xml:space="preserve">Schedules of </w:t>
+            </w:r>
+            <w:proofErr w:type="spellStart"/>
+            <w:r>
+              <w:rPr>
+                <w:rFonts w:asciiTheme="majorBidi" w:hAnsiTheme="majorBidi" w:cstheme="majorBidi"/>
+              </w:rPr>
+              <w:t>BusWay</w:t>
+            </w:r>
+            <w:proofErr w:type="spellEnd"/>
+            <w:r>
+              <w:rPr>
+                <w:rFonts w:asciiTheme="majorBidi" w:hAnsiTheme="majorBidi" w:cstheme="majorBidi"/>
+              </w:rPr>
+              <w:t xml:space="preserve"> and </w:t>
+            </w:r>
+            <w:proofErr w:type="spellStart"/>
+            <w:r>
+              <w:rPr>
+                <w:rFonts w:asciiTheme="majorBidi" w:hAnsiTheme="majorBidi" w:cstheme="majorBidi"/>
+              </w:rPr>
+              <w:t>T</w:t>
             </w:r>
             <w:r>
               <w:rPr>
@@ -550,6 +664,7 @@
               </w:rPr>
               <w:t>ramWay</w:t>
             </w:r>
+            <w:proofErr w:type="spellEnd"/>
           </w:p>
         </w:tc>
         <w:tc>
@@ -620,8 +735,17 @@
                 <w:rFonts w:asciiTheme="majorBidi" w:hAnsiTheme="majorBidi" w:cstheme="majorBidi"/>
                 <w:lang w:val="fr-FR"/>
               </w:rPr>
-              <w:t>Stops of CasaBus</w:t>
-            </w:r>
+              <w:t xml:space="preserve">Stops of </w:t>
+            </w:r>
+            <w:proofErr w:type="spellStart"/>
+            <w:r>
+              <w:rPr>
+                <w:rFonts w:asciiTheme="majorBidi" w:hAnsiTheme="majorBidi" w:cstheme="majorBidi"/>
+                <w:lang w:val="fr-FR"/>
+              </w:rPr>
+              <w:t>CasaBus</w:t>
+            </w:r>
+            <w:proofErr w:type="spellEnd"/>
           </w:p>
         </w:tc>
         <w:tc>
@@ -776,12 +900,14 @@
               <w:jc w:val="center"/>
             </w:pPr>
             <w:hyperlink r:id="rId12" w:history="1">
+              <w:proofErr w:type="spellStart"/>
               <w:r>
                 <w:rPr>
                   <w:rStyle w:val="Hyperlink"/>
                 </w:rPr>
                 <w:t>ghs</w:t>
               </w:r>
+              <w:proofErr w:type="spellEnd"/>
             </w:hyperlink>
           </w:p>
         </w:tc>
@@ -1128,15 +1254,40 @@
       <w:r>
         <w:t xml:space="preserve"> [</w:t>
       </w:r>
+      <w:proofErr w:type="spellStart"/>
       <w:r>
         <w:rPr>
           <w:i/>
           <w:iCs/>
         </w:rPr>
-        <w:t>Derb Sultan</w:t>
-      </w:r>
-      <w:r>
-        <w:t>, Anfa, El Maarif, Sidi Belyout, Ben Chentouf, Al Idrissia]</w:t>
+        <w:t>Derb</w:t>
+      </w:r>
+      <w:proofErr w:type="spellEnd"/>
+      <w:r>
+        <w:rPr>
+          <w:i/>
+          <w:iCs/>
+        </w:rPr>
+        <w:t xml:space="preserve"> Sultan</w:t>
+      </w:r>
+      <w:r>
+        <w:t xml:space="preserve">, Anfa, El Maarif, Sidi </w:t>
+      </w:r>
+      <w:proofErr w:type="spellStart"/>
+      <w:r>
+        <w:t>Belyout</w:t>
+      </w:r>
+      <w:proofErr w:type="spellEnd"/>
+      <w:r>
+        <w:t xml:space="preserve">, Ben Chentouf, Al </w:t>
+      </w:r>
+      <w:proofErr w:type="spellStart"/>
+      <w:r>
+        <w:t>Idrissia</w:t>
+      </w:r>
+      <w:proofErr w:type="spellEnd"/>
+      <w:r>
+        <w:t>]</w:t>
       </w:r>
       <w:r>
         <w:t xml:space="preserve">, </w:t>
@@ -1172,7 +1323,23 @@
         <w:t>Ain Sbaa-Hay Mohammedi</w:t>
       </w:r>
       <w:r>
-        <w:t xml:space="preserve"> [Ain Sebaa, Hay Mohammadi, Assoukhour Assawda]</w:t>
+        <w:t xml:space="preserve"> [Ain Sebaa, Hay Mohammadi, </w:t>
+      </w:r>
+      <w:proofErr w:type="spellStart"/>
+      <w:r>
+        <w:t>Assoukhour</w:t>
+      </w:r>
+      <w:proofErr w:type="spellEnd"/>
+      <w:r>
+        <w:t xml:space="preserve"> </w:t>
+      </w:r>
+      <w:proofErr w:type="spellStart"/>
+      <w:r>
+        <w:t>Assawda</w:t>
+      </w:r>
+      <w:proofErr w:type="spellEnd"/>
+      <w:r>
+        <w:t>]</w:t>
       </w:r>
       <w:r>
         <w:t xml:space="preserve">, </w:t>
@@ -1240,7 +1407,15 @@
         <w:t>Ben M'Sick-Sidi Othmane</w:t>
       </w:r>
       <w:r>
-        <w:t xml:space="preserve"> [Ben M’Sick, Sbata]</w:t>
+        <w:t xml:space="preserve"> [Ben M’Sick, </w:t>
+      </w:r>
+      <w:proofErr w:type="spellStart"/>
+      <w:r>
+        <w:t>Sbata</w:t>
+      </w:r>
+      <w:proofErr w:type="spellEnd"/>
+      <w:r>
+        <w:t>]</w:t>
       </w:r>
       <w:r>
         <w:t xml:space="preserve">, </w:t>
@@ -1254,6 +1429,55 @@
         <w:t xml:space="preserve"> [Hay Hassani]</w:t>
       </w:r>
     </w:p>
+    <w:p/>
+    <w:p>
+      <w:r>
+        <w:t>Anfa</w:t>
+      </w:r>
+      <w:r>
+        <w:t xml:space="preserve">, </w:t>
+      </w:r>
+      <w:r>
+        <w:t>Sidi Bernoussi</w:t>
+      </w:r>
+      <w:r>
+        <w:t xml:space="preserve">, </w:t>
+      </w:r>
+      <w:r>
+        <w:t>Ain Sbaa-Hay Mohammedi</w:t>
+      </w:r>
+      <w:r>
+        <w:t xml:space="preserve">, </w:t>
+      </w:r>
+      <w:r>
+        <w:t>Al Fida-Mers Sultan</w:t>
+      </w:r>
+      <w:r>
+        <w:t xml:space="preserve">, </w:t>
+      </w:r>
+      <w:r>
+        <w:t>Moulay Rachid</w:t>
+      </w:r>
+      <w:r>
+        <w:t xml:space="preserve">,  </w:t>
+      </w:r>
+      <w:r>
+        <w:t>Ain Chock</w:t>
+      </w:r>
+      <w:r>
+        <w:t xml:space="preserve">, </w:t>
+      </w:r>
+      <w:r>
+        <w:t>Ben M'Sick-Sidi Othmane</w:t>
+      </w:r>
+      <w:r>
+        <w:t xml:space="preserve">, </w:t>
+      </w:r>
+      <w:r>
+        <w:t>Hay Hassani</w:t>
+      </w:r>
+    </w:p>
+    <w:p/>
     <w:sectPr>
       <w:pgSz w:w="11906" w:h="16838"/>
       <w:pgMar w:top="1440" w:right="1440" w:bottom="1440" w:left="1440" w:header="708" w:footer="708" w:gutter="0"/>

</xml_diff>